<commit_message>
Texto tachado, versões compiladas, listagem geral e Res. 660/2013
- extração retira texto tachado (redação revogada) de PDFs compilados e o registra
  para conferência (D22); 13 documentos afetados, Código de Ética inalterado
- versões compiladas como referência; originais e cópias fora do índice (D23)
- descoberta pela listagem geral (--apenas-novos): +50 documentos sem categoria,
  incluindo a Res. 660/2013 (Código Processual de Ética) (D24)
- Atividade nº 3 (lote 1) regenerada com conferência dos trechos riscados
- testes: 31 Python, 23 JS

Co-Authored-By: Claude Opus 5.5 <noreply@anthropic.com>
</commit_message>
<xml_diff>
--- a/docs/revisao/Atividade_03_Lote_01.docx
+++ b/docs/revisao/Atividade_03_Lote_01.docx
@@ -1001,7 +1001,7 @@
         </w:rPr>
         <w:t xml:space="preserve">PDF oficial: </w:t>
       </w:r>
-      <w:hyperlink w:history="1" r:id="rIdikflsugg9ytwtkgcllxum">
+      <w:hyperlink w:history="1" r:id="rId7mhfhyeugoclfpvfyiksu">
         <w:r>
           <w:rPr>
             <w:rFonts w:ascii="Calibri" w:cs="Calibri" w:eastAsia="Calibri" w:hAnsi="Calibri"/>
@@ -1021,7 +1021,7 @@
         </w:rPr>
         <w:t xml:space="preserve">   ·   </w:t>
       </w:r>
-      <w:hyperlink w:history="1" r:id="rIdvkcu91vjxdvash1y6fnph">
+      <w:hyperlink w:history="1" r:id="rId3aad99qzaswbxpp0zes7l">
         <w:r>
           <w:rPr>
             <w:rFonts w:ascii="Calibri" w:cs="Calibri" w:eastAsia="Calibri" w:hAnsi="Calibri"/>
@@ -1853,7 +1853,7 @@
         </w:rPr>
         <w:t xml:space="preserve">PDF oficial: </w:t>
       </w:r>
-      <w:hyperlink w:history="1" r:id="rIdho-dvd9emabcsvotcxmjf">
+      <w:hyperlink w:history="1" r:id="rIdnlumophpx5q09t8iukhos">
         <w:r>
           <w:rPr>
             <w:rFonts w:ascii="Calibri" w:cs="Calibri" w:eastAsia="Calibri" w:hAnsi="Calibri"/>
@@ -1873,7 +1873,7 @@
         </w:rPr>
         <w:t xml:space="preserve">   ·   </w:t>
       </w:r>
-      <w:hyperlink w:history="1" r:id="rIdle7rm8-_4mujjqafb_loq">
+      <w:hyperlink w:history="1" r:id="rIdloai_meiqysryq0xf9ixh">
         <w:r>
           <w:rPr>
             <w:rFonts w:ascii="Calibri" w:cs="Calibri" w:eastAsia="Calibri" w:hAnsi="Calibri"/>
@@ -2705,7 +2705,7 @@
         </w:rPr>
         <w:t xml:space="preserve">PDF oficial: </w:t>
       </w:r>
-      <w:hyperlink w:history="1" r:id="rIdadzpep-ddb_bwkfrm8dl4">
+      <w:hyperlink w:history="1" r:id="rId1kxskczobyinl3wvkrszx">
         <w:r>
           <w:rPr>
             <w:rFonts w:ascii="Calibri" w:cs="Calibri" w:eastAsia="Calibri" w:hAnsi="Calibri"/>
@@ -2725,7 +2725,7 @@
         </w:rPr>
         <w:t xml:space="preserve">   ·   </w:t>
       </w:r>
-      <w:hyperlink w:history="1" r:id="rId778tidhrhjmrh5r0qu86d">
+      <w:hyperlink w:history="1" r:id="rIduqypdxzcpqyeb4n88xku1">
         <w:r>
           <w:rPr>
             <w:rFonts w:ascii="Calibri" w:cs="Calibri" w:eastAsia="Calibri" w:hAnsi="Calibri"/>
@@ -3523,7 +3523,7 @@
         </w:rPr>
         <w:t xml:space="preserve">PDF oficial: </w:t>
       </w:r>
-      <w:hyperlink w:history="1" r:id="rId6zjtrpix_q11yzlxspzya">
+      <w:hyperlink w:history="1" r:id="rIdcxw2vd5wlsrpgaeuygjzy">
         <w:r>
           <w:rPr>
             <w:rFonts w:ascii="Calibri" w:cs="Calibri" w:eastAsia="Calibri" w:hAnsi="Calibri"/>
@@ -3543,7 +3543,7 @@
         </w:rPr>
         <w:t xml:space="preserve">   ·   </w:t>
       </w:r>
-      <w:hyperlink w:history="1" r:id="rIdkxjntyjrrxdpmasvj_i1u">
+      <w:hyperlink w:history="1" r:id="rId8ar1allhigc9iozwdwmbd">
         <w:r>
           <w:rPr>
             <w:rFonts w:ascii="Calibri" w:cs="Calibri" w:eastAsia="Calibri" w:hAnsi="Calibri"/>
@@ -4341,7 +4341,7 @@
         </w:rPr>
         <w:t xml:space="preserve">PDF oficial: </w:t>
       </w:r>
-      <w:hyperlink w:history="1" r:id="rId-q5k-9apsccnjlhi-wkdj">
+      <w:hyperlink w:history="1" r:id="rId0xkmxywlbrofczurfp1qh">
         <w:r>
           <w:rPr>
             <w:rFonts w:ascii="Calibri" w:cs="Calibri" w:eastAsia="Calibri" w:hAnsi="Calibri"/>
@@ -4361,7 +4361,7 @@
         </w:rPr>
         <w:t xml:space="preserve">   ·   </w:t>
       </w:r>
-      <w:hyperlink w:history="1" r:id="rIdgunvv1x7bprgvbuhcumgw">
+      <w:hyperlink w:history="1" r:id="rIdxhf7i72mnjb_h0vpjcuhp">
         <w:r>
           <w:rPr>
             <w:rFonts w:ascii="Calibri" w:cs="Calibri" w:eastAsia="Calibri" w:hAnsi="Calibri"/>
@@ -4717,7 +4717,7 @@
                 <w:sz w:val="22"/>
                 <w:szCs w:val="22"/>
               </w:rPr>
-              <w:t xml:space="preserve">Art. 13, inciso IV</w:t>
+              <w:t xml:space="preserve">Art. 13, inciso II</w:t>
             </w:r>
           </w:p>
         </w:tc>
@@ -4771,7 +4771,7 @@
                 <w:sz w:val="22"/>
                 <w:szCs w:val="22"/>
               </w:rPr>
-              <w:t xml:space="preserve">IV- Dar encaminhamentos às rotinas da comissão, propondo providências, esclarecendo e orientando o Assistente Social, instituições, usuários e outros, sobre procedimentos e dúvidas suscitadas;</w:t>
+              <w:t xml:space="preserve">II- Propor e realizar atividades preventivas de orientação e discussão junto aos profissionais e instituições, em consonância com as diretrizes da PNF e plano de ação da COFI;</w:t>
             </w:r>
           </w:p>
         </w:tc>
@@ -4841,7 +4841,7 @@
                 <w:sz w:val="22"/>
                 <w:szCs w:val="22"/>
               </w:rPr>
-              <w:t xml:space="preserve">Art. 19, inciso II</w:t>
+              <w:t xml:space="preserve">Art. 19, inciso III</w:t>
             </w:r>
           </w:p>
         </w:tc>
@@ -4895,7 +4895,7 @@
                 <w:sz w:val="22"/>
                 <w:szCs w:val="22"/>
               </w:rPr>
-              <w:t xml:space="preserve">II- Capacitação de profissionais para operacionalização do Código de Ética Profissional e do Código Processual de Ética, através de grupos de estudo, treinamentos, cursos, palestras, etc;</w:t>
+              <w:t xml:space="preserve">III- Instrumentalização dos conselheiros do CRESS e membros das Seccionais para atuarem como agentes multiplicadores dos preceitos éticos da profissão;</w:t>
             </w:r>
           </w:p>
         </w:tc>
@@ -4986,7 +4986,7 @@
           <w:sz w:val="20"/>
           <w:szCs w:val="20"/>
         </w:rPr>
-        <w:t xml:space="preserve">A Res. 828/2017 altera dispositivos desta resolução (ementa do portal).</w:t>
+        <w:t xml:space="preserve">A Res. 828/2017 altera dispositivos desta resolução (ementa do portal). O PDF é uma versão com trechos riscados.</w:t>
       </w:r>
     </w:p>
     <w:p>
@@ -5102,7 +5102,346 @@
           <w:sz w:val="22"/>
           <w:szCs w:val="22"/>
         </w:rPr>
-        <w:t xml:space="preserve">d) Observações</w:t>
+        <w:t xml:space="preserve">d) Trechos riscados retirados pelo sistema</w:t>
+      </w:r>
+    </w:p>
+    <w:p>
+      <w:pPr>
+        <w:spacing w:after="100"/>
+      </w:pPr>
+      <w:r>
+        <w:rPr>
+          <w:rFonts w:ascii="Calibri" w:cs="Calibri" w:eastAsia="Calibri" w:hAnsi="Calibri"/>
+          <w:sz w:val="22"/>
+          <w:szCs w:val="22"/>
+        </w:rPr>
+        <w:t xml:space="preserve">O PDF traz trechos riscados (redação revogada). O sistema os retirou do texto pesquisável. Confirme que estão mesmo riscados no PDF:</w:t>
+      </w:r>
+    </w:p>
+    <w:tbl>
+      <w:tblPr>
+        <w:tblW w:type="dxa" w:w="9638"/>
+        <w:tblBorders>
+          <w:top w:val="single" w:color="auto" w:sz="4"/>
+          <w:left w:val="single" w:color="auto" w:sz="4"/>
+          <w:bottom w:val="single" w:color="auto" w:sz="4"/>
+          <w:right w:val="single" w:color="auto" w:sz="4"/>
+          <w:insideH w:val="single" w:color="auto" w:sz="4"/>
+          <w:insideV w:val="single" w:color="auto" w:sz="4"/>
+        </w:tblBorders>
+      </w:tblPr>
+      <w:tblGrid>
+        <w:gridCol w:w="700"/>
+        <w:gridCol w:w="7438"/>
+        <w:gridCol w:w="1500"/>
+      </w:tblGrid>
+      <w:tr>
+        <w:trPr>
+          <w:tblHeader/>
+        </w:trPr>
+        <w:tc>
+          <w:tcPr>
+            <w:tcW w:type="dxa" w:w="700"/>
+            <w:tcBorders>
+              <w:top w:val="single" w:color="B9C4D0" w:sz="4"/>
+              <w:left w:val="single" w:color="B9C4D0" w:sz="4"/>
+              <w:bottom w:val="single" w:color="B9C4D0" w:sz="4"/>
+              <w:right w:val="single" w:color="B9C4D0" w:sz="4"/>
+            </w:tcBorders>
+            <w:shd w:fill="173456" w:color="auto" w:val="clear"/>
+            <w:tcMar>
+              <w:top w:type="dxa" w:w="60"/>
+              <w:left w:type="dxa" w:w="100"/>
+              <w:bottom w:type="dxa" w:w="60"/>
+              <w:right w:type="dxa" w:w="100"/>
+            </w:tcMar>
+          </w:tcPr>
+          <w:p>
+            <w:r>
+              <w:rPr>
+                <w:rFonts w:ascii="Calibri" w:cs="Calibri" w:eastAsia="Calibri" w:hAnsi="Calibri"/>
+                <w:b/>
+                <w:bCs/>
+                <w:color w:val="FFFFFF"/>
+                <w:sz w:val="22"/>
+                <w:szCs w:val="22"/>
+              </w:rPr>
+              <w:t xml:space="preserve">Pág.</w:t>
+            </w:r>
+          </w:p>
+        </w:tc>
+        <w:tc>
+          <w:tcPr>
+            <w:tcW w:type="dxa" w:w="7438"/>
+            <w:tcBorders>
+              <w:top w:val="single" w:color="B9C4D0" w:sz="4"/>
+              <w:left w:val="single" w:color="B9C4D0" w:sz="4"/>
+              <w:bottom w:val="single" w:color="B9C4D0" w:sz="4"/>
+              <w:right w:val="single" w:color="B9C4D0" w:sz="4"/>
+            </w:tcBorders>
+            <w:shd w:fill="173456" w:color="auto" w:val="clear"/>
+            <w:tcMar>
+              <w:top w:type="dxa" w:w="60"/>
+              <w:left w:type="dxa" w:w="100"/>
+              <w:bottom w:type="dxa" w:w="60"/>
+              <w:right w:type="dxa" w:w="100"/>
+            </w:tcMar>
+          </w:tcPr>
+          <w:p>
+            <w:r>
+              <w:rPr>
+                <w:rFonts w:ascii="Calibri" w:cs="Calibri" w:eastAsia="Calibri" w:hAnsi="Calibri"/>
+                <w:b/>
+                <w:bCs/>
+                <w:color w:val="FFFFFF"/>
+                <w:sz w:val="22"/>
+                <w:szCs w:val="22"/>
+              </w:rPr>
+              <w:t xml:space="preserve">Texto retirado (início)</w:t>
+            </w:r>
+          </w:p>
+        </w:tc>
+        <w:tc>
+          <w:tcPr>
+            <w:tcW w:type="dxa" w:w="1500"/>
+            <w:tcBorders>
+              <w:top w:val="single" w:color="B9C4D0" w:sz="4"/>
+              <w:left w:val="single" w:color="B9C4D0" w:sz="4"/>
+              <w:bottom w:val="single" w:color="B9C4D0" w:sz="4"/>
+              <w:right w:val="single" w:color="B9C4D0" w:sz="4"/>
+            </w:tcBorders>
+            <w:shd w:fill="173456" w:color="auto" w:val="clear"/>
+            <w:tcMar>
+              <w:top w:type="dxa" w:w="60"/>
+              <w:left w:type="dxa" w:w="100"/>
+              <w:bottom w:type="dxa" w:w="60"/>
+              <w:right w:type="dxa" w:w="100"/>
+            </w:tcMar>
+          </w:tcPr>
+          <w:p>
+            <w:r>
+              <w:rPr>
+                <w:rFonts w:ascii="Calibri" w:cs="Calibri" w:eastAsia="Calibri" w:hAnsi="Calibri"/>
+                <w:b/>
+                <w:bCs/>
+                <w:color w:val="FFFFFF"/>
+                <w:sz w:val="22"/>
+                <w:szCs w:val="22"/>
+              </w:rPr>
+              <w:t xml:space="preserve">Riscado?</w:t>
+            </w:r>
+          </w:p>
+        </w:tc>
+      </w:tr>
+      <w:tr>
+        <w:trPr>
+          <w:cantSplit/>
+        </w:trPr>
+        <w:tc>
+          <w:tcPr>
+            <w:tcW w:type="dxa" w:w="700"/>
+            <w:tcBorders>
+              <w:top w:val="single" w:color="B9C4D0" w:sz="4"/>
+              <w:left w:val="single" w:color="B9C4D0" w:sz="4"/>
+              <w:bottom w:val="single" w:color="B9C4D0" w:sz="4"/>
+              <w:right w:val="single" w:color="B9C4D0" w:sz="4"/>
+            </w:tcBorders>
+            <w:tcMar>
+              <w:top w:type="dxa" w:w="60"/>
+              <w:left w:type="dxa" w:w="100"/>
+              <w:bottom w:type="dxa" w:w="60"/>
+              <w:right w:type="dxa" w:w="100"/>
+            </w:tcMar>
+          </w:tcPr>
+          <w:p>
+            <w:r>
+              <w:rPr>
+                <w:rFonts w:ascii="Calibri" w:cs="Calibri" w:eastAsia="Calibri" w:hAnsi="Calibri"/>
+                <w:sz w:val="22"/>
+                <w:szCs w:val="22"/>
+              </w:rPr>
+              <w:t xml:space="preserve">5</w:t>
+            </w:r>
+          </w:p>
+        </w:tc>
+        <w:tc>
+          <w:tcPr>
+            <w:tcW w:type="dxa" w:w="7438"/>
+            <w:tcBorders>
+              <w:top w:val="single" w:color="B9C4D0" w:sz="4"/>
+              <w:left w:val="single" w:color="B9C4D0" w:sz="4"/>
+              <w:bottom w:val="single" w:color="B9C4D0" w:sz="4"/>
+              <w:right w:val="single" w:color="B9C4D0" w:sz="4"/>
+            </w:tcBorders>
+            <w:tcMar>
+              <w:top w:type="dxa" w:w="60"/>
+              <w:left w:type="dxa" w:w="100"/>
+              <w:bottom w:type="dxa" w:w="60"/>
+              <w:right w:type="dxa" w:w="100"/>
+            </w:tcMar>
+          </w:tcPr>
+          <w:p>
+            <w:r>
+              <w:rPr>
+                <w:rFonts w:ascii="Calibri" w:cs="Calibri" w:eastAsia="Calibri" w:hAnsi="Calibri"/>
+                <w:sz w:val="22"/>
+                <w:szCs w:val="22"/>
+              </w:rPr>
+              <w:t xml:space="preserve">Descrever no relatório de visita de fiscalização todo fato constatado, relatando qualquerirregularidade que comprometa a qualidade dos serviços profissionais prestados, anotando nomeendereço e número de RG das pessoas envolvidas e testemunhas se houver;</w:t>
+            </w:r>
+          </w:p>
+        </w:tc>
+        <w:tc>
+          <w:tcPr>
+            <w:tcW w:type="dxa" w:w="1500"/>
+            <w:tcBorders>
+              <w:top w:val="single" w:color="B9C4D0" w:sz="4"/>
+              <w:left w:val="single" w:color="B9C4D0" w:sz="4"/>
+              <w:bottom w:val="single" w:color="B9C4D0" w:sz="4"/>
+              <w:right w:val="single" w:color="B9C4D0" w:sz="4"/>
+            </w:tcBorders>
+            <w:shd w:fill="F2F6FB" w:color="auto" w:val="clear"/>
+            <w:tcMar>
+              <w:top w:type="dxa" w:w="60"/>
+              <w:left w:type="dxa" w:w="100"/>
+              <w:bottom w:type="dxa" w:w="60"/>
+              <w:right w:type="dxa" w:w="100"/>
+            </w:tcMar>
+          </w:tcPr>
+          <w:p>
+            <w:r>
+              <w:rPr>
+                <w:rFonts w:ascii="Calibri" w:cs="Calibri" w:eastAsia="Calibri" w:hAnsi="Calibri"/>
+                <w:sz w:val="22"/>
+                <w:szCs w:val="22"/>
+              </w:rPr>
+              <w:t xml:space="preserve">☐ Sim</w:t>
+            </w:r>
+          </w:p>
+          <w:p>
+            <w:r>
+              <w:rPr>
+                <w:rFonts w:ascii="Calibri" w:cs="Calibri" w:eastAsia="Calibri" w:hAnsi="Calibri"/>
+                <w:sz w:val="22"/>
+                <w:szCs w:val="22"/>
+              </w:rPr>
+              <w:t xml:space="preserve">☐ Não</w:t>
+            </w:r>
+          </w:p>
+        </w:tc>
+      </w:tr>
+      <w:tr>
+        <w:trPr>
+          <w:cantSplit/>
+        </w:trPr>
+        <w:tc>
+          <w:tcPr>
+            <w:tcW w:type="dxa" w:w="700"/>
+            <w:tcBorders>
+              <w:top w:val="single" w:color="B9C4D0" w:sz="4"/>
+              <w:left w:val="single" w:color="B9C4D0" w:sz="4"/>
+              <w:bottom w:val="single" w:color="B9C4D0" w:sz="4"/>
+              <w:right w:val="single" w:color="B9C4D0" w:sz="4"/>
+            </w:tcBorders>
+            <w:tcMar>
+              <w:top w:type="dxa" w:w="60"/>
+              <w:left w:type="dxa" w:w="100"/>
+              <w:bottom w:type="dxa" w:w="60"/>
+              <w:right w:type="dxa" w:w="100"/>
+            </w:tcMar>
+          </w:tcPr>
+          <w:p>
+            <w:r>
+              <w:rPr>
+                <w:rFonts w:ascii="Calibri" w:cs="Calibri" w:eastAsia="Calibri" w:hAnsi="Calibri"/>
+                <w:sz w:val="22"/>
+                <w:szCs w:val="22"/>
+              </w:rPr>
+              <w:t xml:space="preserve">6</w:t>
+            </w:r>
+          </w:p>
+        </w:tc>
+        <w:tc>
+          <w:tcPr>
+            <w:tcW w:type="dxa" w:w="7438"/>
+            <w:tcBorders>
+              <w:top w:val="single" w:color="B9C4D0" w:sz="4"/>
+              <w:left w:val="single" w:color="B9C4D0" w:sz="4"/>
+              <w:bottom w:val="single" w:color="B9C4D0" w:sz="4"/>
+              <w:right w:val="single" w:color="B9C4D0" w:sz="4"/>
+            </w:tcBorders>
+            <w:tcMar>
+              <w:top w:type="dxa" w:w="60"/>
+              <w:left w:type="dxa" w:w="100"/>
+              <w:bottom w:type="dxa" w:w="60"/>
+              <w:right w:type="dxa" w:w="100"/>
+            </w:tcMar>
+          </w:tcPr>
+          <w:p>
+            <w:r>
+              <w:rPr>
+                <w:rFonts w:ascii="Calibri" w:cs="Calibri" w:eastAsia="Calibri" w:hAnsi="Calibri"/>
+                <w:sz w:val="22"/>
+                <w:szCs w:val="22"/>
+              </w:rPr>
+              <w:t xml:space="preserve">Art. 17Ficam instituídos os instrumentais básicos a serem utilizados no exercício da ação fiscalizadoraque constarão como anexo da Política Nacional de Fiscalização, a saber:I- Relatório de Visita de Fiscalizaçãoa ser utilizado pelo agente fiscal ou representante doCRESS/ Seccional, nas situações de…</w:t>
+            </w:r>
+          </w:p>
+        </w:tc>
+        <w:tc>
+          <w:tcPr>
+            <w:tcW w:type="dxa" w:w="1500"/>
+            <w:tcBorders>
+              <w:top w:val="single" w:color="B9C4D0" w:sz="4"/>
+              <w:left w:val="single" w:color="B9C4D0" w:sz="4"/>
+              <w:bottom w:val="single" w:color="B9C4D0" w:sz="4"/>
+              <w:right w:val="single" w:color="B9C4D0" w:sz="4"/>
+            </w:tcBorders>
+            <w:shd w:fill="F2F6FB" w:color="auto" w:val="clear"/>
+            <w:tcMar>
+              <w:top w:type="dxa" w:w="60"/>
+              <w:left w:type="dxa" w:w="100"/>
+              <w:bottom w:type="dxa" w:w="60"/>
+              <w:right w:type="dxa" w:w="100"/>
+            </w:tcMar>
+          </w:tcPr>
+          <w:p>
+            <w:r>
+              <w:rPr>
+                <w:rFonts w:ascii="Calibri" w:cs="Calibri" w:eastAsia="Calibri" w:hAnsi="Calibri"/>
+                <w:sz w:val="22"/>
+                <w:szCs w:val="22"/>
+              </w:rPr>
+              <w:t xml:space="preserve">☐ Sim</w:t>
+            </w:r>
+          </w:p>
+          <w:p>
+            <w:r>
+              <w:rPr>
+                <w:rFonts w:ascii="Calibri" w:cs="Calibri" w:eastAsia="Calibri" w:hAnsi="Calibri"/>
+                <w:sz w:val="22"/>
+                <w:szCs w:val="22"/>
+              </w:rPr>
+              <w:t xml:space="preserve">☐ Não</w:t>
+            </w:r>
+          </w:p>
+        </w:tc>
+      </w:tr>
+    </w:tbl>
+    <w:p>
+      <w:pPr>
+        <w:keepNext/>
+        <w:spacing w:before="180" w:after="80"/>
+      </w:pPr>
+      <w:r>
+        <w:rPr>
+          <w:rFonts w:ascii="Calibri" w:cs="Calibri" w:eastAsia="Calibri" w:hAnsi="Calibri"/>
+          <w:b/>
+          <w:bCs/>
+          <w:sz w:val="22"/>
+          <w:szCs w:val="22"/>
+        </w:rPr>
+        <w:t xml:space="preserve">e) Observações</w:t>
       </w:r>
     </w:p>
     <w:tbl>
@@ -5211,7 +5550,7 @@
         </w:rPr>
         <w:t xml:space="preserve">PDF oficial: </w:t>
       </w:r>
-      <w:hyperlink w:history="1" r:id="rIdllbd3-w-zhja2gnzqhnbc">
+      <w:hyperlink w:history="1" r:id="rIdyp9cttvzjhnduvuljeb17">
         <w:r>
           <w:rPr>
             <w:rFonts w:ascii="Calibri" w:cs="Calibri" w:eastAsia="Calibri" w:hAnsi="Calibri"/>
@@ -5231,7 +5570,7 @@
         </w:rPr>
         <w:t xml:space="preserve">   ·   </w:t>
       </w:r>
-      <w:hyperlink w:history="1" r:id="rId4m0yqxlggjct9hlcvtezx">
+      <w:hyperlink w:history="1" r:id="rId8xu06ceg4ofnuc4wcpa--">
         <w:r>
           <w:rPr>
             <w:rFonts w:ascii="Calibri" w:cs="Calibri" w:eastAsia="Calibri" w:hAnsi="Calibri"/>
@@ -5874,6 +6213,24 @@
           <w:sz w:val="20"/>
           <w:szCs w:val="20"/>
         </w:rPr>
+        <w:t xml:space="preserve">O portal publica também uma versão compilada desta resolução, mas a leitura automática dela saiu ilegível; por isso a conferência é feita no texto original.</w:t>
+      </w:r>
+    </w:p>
+    <w:p>
+      <w:pPr>
+        <w:pStyle w:val="ListParagraph"/>
+        <w:numPr>
+          <w:ilvl w:val="0"/>
+          <w:numId w:val="3"/>
+        </w:numPr>
+      </w:pPr>
+      <w:r>
+        <w:rPr>
+          <w:rFonts w:ascii="Calibri" w:cs="Calibri" w:eastAsia="Calibri" w:hAnsi="Calibri"/>
+          <w:color w:val="4F5D70"/>
+          <w:sz w:val="20"/>
+          <w:szCs w:val="20"/>
+        </w:rPr>
         <w:t xml:space="preserve">O próprio texto menciona: Resolução CFESS no 354/1997 (possível revogacao)</w:t>
       </w:r>
     </w:p>
@@ -6189,7 +6546,7 @@
         </w:rPr>
         <w:t xml:space="preserve">PDF oficial: </w:t>
       </w:r>
-      <w:hyperlink w:history="1" r:id="rIdapteemuwckv65sdvum3cl">
+      <w:hyperlink w:history="1" r:id="rIdj08omqyuvhst-9zf9o5qn">
         <w:r>
           <w:rPr>
             <w:rFonts w:ascii="Calibri" w:cs="Calibri" w:eastAsia="Calibri" w:hAnsi="Calibri"/>
@@ -6209,7 +6566,7 @@
         </w:rPr>
         <w:t xml:space="preserve">   ·   </w:t>
       </w:r>
-      <w:hyperlink w:history="1" r:id="rId66zpp6w6m-lqp-xqxapn5">
+      <w:hyperlink w:history="1" r:id="rIdyugokddkydgmtbqpdyyry">
         <w:r>
           <w:rPr>
             <w:rFonts w:ascii="Calibri" w:cs="Calibri" w:eastAsia="Calibri" w:hAnsi="Calibri"/>
@@ -7041,7 +7398,7 @@
         </w:rPr>
         <w:t xml:space="preserve">PDF oficial: </w:t>
       </w:r>
-      <w:hyperlink w:history="1" r:id="rIdxt1u-hoso6kxztaws8yn8">
+      <w:hyperlink w:history="1" r:id="rIde7pko_c3yuw0yajoifq3u">
         <w:r>
           <w:rPr>
             <w:rFonts w:ascii="Calibri" w:cs="Calibri" w:eastAsia="Calibri" w:hAnsi="Calibri"/>
@@ -7061,7 +7418,7 @@
         </w:rPr>
         <w:t xml:space="preserve">   ·   </w:t>
       </w:r>
-      <w:hyperlink w:history="1" r:id="rId6xokpy8qwp3xgtmpeqwlz">
+      <w:hyperlink w:history="1" r:id="rIdcveyz7xipelrdu6khxjqy">
         <w:r>
           <w:rPr>
             <w:rFonts w:ascii="Calibri" w:cs="Calibri" w:eastAsia="Calibri" w:hAnsi="Calibri"/>

</xml_diff>